<commit_message>
Add WISP 2026 details
</commit_message>
<xml_diff>
--- a/assets/docs/wisp_2026_paper_template.docx
+++ b/assets/docs/wisp_2026_paper_template.docx
@@ -1,6 +1,6 @@
 
 <file path=word/document.xml><?xml version="1.0" encoding="utf-8"?>
-<w:document xmlns:wpc="http://schemas.microsoft.com/office/word/2010/wordprocessingCanvas" xmlns:cx="http://schemas.microsoft.com/office/drawing/2014/chartex" xmlns:cx1="http://schemas.microsoft.com/office/drawing/2015/9/8/chartex" xmlns:cx2="http://schemas.microsoft.com/office/drawing/2015/10/21/chartex" xmlns:cx3="http://schemas.microsoft.com/office/drawing/2016/5/9/chartex" xmlns:cx4="http://schemas.microsoft.com/office/drawing/2016/5/10/chartex" xmlns:cx5="http://schemas.microsoft.com/office/drawing/2016/5/11/chartex" xmlns:cx6="http://schemas.microsoft.com/office/drawing/2016/5/12/chartex" xmlns:cx7="http://schemas.microsoft.com/office/drawing/2016/5/13/chartex" xmlns:cx8="http://schemas.microsoft.com/office/drawing/2016/5/14/chartex" xmlns:mc="http://schemas.openxmlformats.org/markup-compatibility/2006" xmlns:aink="http://schemas.microsoft.com/office/drawing/2016/ink" xmlns:am3d="http://schemas.microsoft.com/office/drawing/2017/model3d" xmlns:o="urn:schemas-microsoft-com:office:office" xmlns:oel="http://schemas.microsoft.com/office/2019/extlst" xmlns:r="http://schemas.openxmlformats.org/officeDocument/2006/relationships" xmlns:m="http://schemas.openxmlformats.org/officeDocument/2006/math" xmlns:v="urn:schemas-microsoft-com:vml" xmlns:wp14="http://schemas.microsoft.com/office/word/2010/wordprocessingDrawing" xmlns:wp="http://schemas.openxmlformats.org/drawingml/2006/wordprocessingDrawing" xmlns:w10="urn:schemas-microsoft-com:office:word" xmlns:w="http://schemas.openxmlformats.org/wordprocessingml/2006/main" xmlns:w14="http://schemas.microsoft.com/office/word/2010/wordml" xmlns:w15="http://schemas.microsoft.com/office/word/2012/wordml" xmlns:w16cex="http://schemas.microsoft.com/office/word/2018/wordml/cex" xmlns:w16cid="http://schemas.microsoft.com/office/word/2016/wordml/cid" xmlns:w16="http://schemas.microsoft.com/office/word/2018/wordml" xmlns:w16du="http://schemas.microsoft.com/office/word/2023/wordml/word16du" xmlns:w16sdtdh="http://schemas.microsoft.com/office/word/2020/wordml/sdtdatahash" xmlns:w16sdtfl="http://schemas.microsoft.com/office/word/2024/wordml/sdtformatlock" xmlns:w16se="http://schemas.microsoft.com/office/word/2015/wordml/symex" xmlns:wpg="http://schemas.microsoft.com/office/word/2010/wordprocessingGroup" xmlns:wpi="http://schemas.microsoft.com/office/word/2010/wordprocessingInk" xmlns:wne="http://schemas.microsoft.com/office/word/2006/wordml" xmlns:wps="http://schemas.microsoft.com/office/word/2010/wordprocessingShape" mc:Ignorable="w14 w15 w16se w16cid w16 w16cex w16sdtdh w16sdtfl w16du wp14">
+<w:document xmlns:wpc="http://schemas.microsoft.com/office/word/2010/wordprocessingCanvas" xmlns:cx="http://schemas.microsoft.com/office/drawing/2014/chartex" xmlns:cx1="http://schemas.microsoft.com/office/drawing/2015/9/8/chartex" xmlns:cx2="http://schemas.microsoft.com/office/drawing/2015/10/21/chartex" xmlns:cx3="http://schemas.microsoft.com/office/drawing/2016/5/9/chartex" xmlns:cx4="http://schemas.microsoft.com/office/drawing/2016/5/10/chartex" xmlns:cx5="http://schemas.microsoft.com/office/drawing/2016/5/11/chartex" xmlns:cx6="http://schemas.microsoft.com/office/drawing/2016/5/12/chartex" xmlns:cx7="http://schemas.microsoft.com/office/drawing/2016/5/13/chartex" xmlns:cx8="http://schemas.microsoft.com/office/drawing/2016/5/14/chartex" xmlns:mc="http://schemas.openxmlformats.org/markup-compatibility/2006" xmlns:m="http://schemas.openxmlformats.org/officeDocument/2006/math" xmlns:aink="http://schemas.microsoft.com/office/drawing/2016/ink" xmlns:am3d="http://schemas.microsoft.com/office/drawing/2017/model3d" xmlns:oel="http://schemas.microsoft.com/office/2019/extlst" xmlns:r="http://schemas.openxmlformats.org/officeDocument/2006/relationships" xmlns:wp14="http://schemas.microsoft.com/office/word/2010/wordprocessingDrawing" xmlns:wp="http://schemas.openxmlformats.org/drawingml/2006/wordprocessingDrawing" xmlns:wpg="http://schemas.microsoft.com/office/word/2010/wordprocessingGroup" xmlns:wpi="http://schemas.microsoft.com/office/word/2010/wordprocessingInk" xmlns:wps="http://schemas.microsoft.com/office/word/2010/wordprocessingShape" xmlns:o="urn:schemas-microsoft-com:office:office" xmlns:v="urn:schemas-microsoft-com:vml" xmlns:w10="urn:schemas-microsoft-com:office:word" xmlns:w="http://schemas.openxmlformats.org/wordprocessingml/2006/main" xmlns:w14="http://schemas.microsoft.com/office/word/2010/wordml" xmlns:w15="http://schemas.microsoft.com/office/word/2012/wordml" xmlns:w16cex="http://schemas.microsoft.com/office/word/2018/wordml/cex" xmlns:w16cid="http://schemas.microsoft.com/office/word/2016/wordml/cid" xmlns:w16="http://schemas.microsoft.com/office/word/2018/wordml" xmlns:w16sdtdh="http://schemas.microsoft.com/office/word/2020/wordml/sdtdatahash" xmlns:w16sdtfl="http://schemas.microsoft.com/office/word/2024/wordml/sdtformatlock" xmlns:w16se="http://schemas.microsoft.com/office/word/2015/wordml/symex" xmlns:w16du="http://schemas.microsoft.com/office/word/2023/wordml/word16du" xmlns:wne="http://schemas.microsoft.com/office/word/2006/wordml" mc:Ignorable="w14 w15 w16se w16cid w16 w16cex w16sdtdh w16sdtfl w16du wp14">
   <w:body>
     <w:p>
       <w:pPr>
@@ -584,15 +584,7 @@
         <w:ind w:firstLine="720"/>
       </w:pPr>
       <w:r>
-        <w:t xml:space="preserve">We ask that authors follow these basic guidelines when </w:t>
-      </w:r>
-      <w:proofErr w:type="gramStart"/>
-      <w:r>
-        <w:t>submitting</w:t>
-      </w:r>
-      <w:proofErr w:type="gramEnd"/>
-      <w:r>
-        <w:t xml:space="preserve"> to </w:t>
+        <w:t xml:space="preserve">We ask that authors follow these basic guidelines when submitting to </w:t>
       </w:r>
       <w:r>
         <w:t>the Workshop on Information Security &amp; Privacy</w:t>
@@ -724,6 +716,11 @@
           <w:highlight w:val="yellow"/>
         </w:rPr>
         <w:fldChar w:fldCharType="end"/>
+      </w:r>
+      <w:r>
+        <w:rPr>
+          <w:highlight w:val="yellow"/>
+        </w:rPr>
       </w:r>
       <w:r>
         <w:rPr>
@@ -973,6 +970,11 @@
         <w:rPr>
           <w:highlight w:val="yellow"/>
         </w:rPr>
+      </w:r>
+      <w:r>
+        <w:rPr>
+          <w:highlight w:val="yellow"/>
+        </w:rPr>
         <w:fldChar w:fldCharType="separate"/>
       </w:r>
       <w:r>
@@ -1123,15 +1125,7 @@
         <w:t>regular font</w:t>
       </w:r>
       <w:r>
-        <w:t xml:space="preserve">, </w:t>
-      </w:r>
-      <w:proofErr w:type="gramStart"/>
-      <w:r>
-        <w:t>full</w:t>
-      </w:r>
-      <w:proofErr w:type="gramEnd"/>
-      <w:r>
-        <w:t xml:space="preserve"> justified with left </w:t>
+        <w:t xml:space="preserve">, full justified with left </w:t>
       </w:r>
       <w:r>
         <w:lastRenderedPageBreak/>
@@ -1278,15 +1272,7 @@
         <w:t>, styles should apply</w:t>
       </w:r>
       <w:r>
-        <w:t xml:space="preserve"> for prepositions (on, at, </w:t>
-      </w:r>
-      <w:proofErr w:type="gramStart"/>
-      <w:r>
-        <w:t>to</w:t>
-      </w:r>
-      <w:proofErr w:type="gramEnd"/>
-      <w:r>
-        <w:t>, from, by, etc.)</w:t>
+        <w:t xml:space="preserve"> for prepositions (on, at, to, from, by, etc.)</w:t>
       </w:r>
       <w:r>
         <w:t>.</w:t>
@@ -1854,15 +1840,7 @@
       </w:pPr>
       <w:bookmarkStart w:id="2" w:name="_Toc322602367"/>
       <w:r>
-        <w:t xml:space="preserve">It is important that you write for a general audience. It is also important that your work is presented in a professional fashion. This guideline is intended to help you achieve that goal. By adhering to the </w:t>
-      </w:r>
-      <w:proofErr w:type="gramStart"/>
-      <w:r>
-        <w:t>guideline</w:t>
-      </w:r>
-      <w:proofErr w:type="gramEnd"/>
-      <w:r>
-        <w:t>, you also help the conference organizers tremendously in reducing our workload and ensuring impressive presentation of your conference paper. We thank you very much for your cooperation and look forward to receiving a professional looking, camera-ready version</w:t>
+        <w:t>It is important that you write for a general audience. It is also important that your work is presented in a professional fashion. This guideline is intended to help you achieve that goal. By adhering to the guideline, you also help the conference organizers tremendously in reducing our workload and ensuring impressive presentation of your conference paper. We thank you very much for your cooperation and look forward to receiving a professional looking, camera-ready version</w:t>
       </w:r>
       <w:r>
         <w:t>!</w:t>
@@ -1957,23 +1935,7 @@
             <w:b/>
             <w:highlight w:val="yellow"/>
           </w:rPr>
-          <w:t>https://github.com/citation-style-language/styles/blo</w:t>
-        </w:r>
-        <w:r>
-          <w:rPr>
-            <w:rStyle w:val="Hyperlink"/>
-            <w:b/>
-            <w:highlight w:val="yellow"/>
-          </w:rPr>
-          <w:t>b</w:t>
-        </w:r>
-        <w:r>
-          <w:rPr>
-            <w:rStyle w:val="Hyperlink"/>
-            <w:b/>
-            <w:highlight w:val="yellow"/>
-          </w:rPr>
-          <w:t>/149a664d26b80c572a26aaf9184088eea2f65454/mis-quarterly.csl</w:t>
+          <w:t>https://github.com/citation-style-language/styles/blob/149a664d26b80c572a26aaf9184088eea2f65454/mis-quarterly.csl</w:t>
         </w:r>
       </w:hyperlink>
       <w:r>
@@ -1987,21 +1949,7 @@
         <w:rPr>
           <w:highlight w:val="yellow"/>
         </w:rPr>
-        <w:t xml:space="preserve"> References must be complete, i.e., include, as </w:t>
-      </w:r>
-      <w:proofErr w:type="gramStart"/>
-      <w:r>
-        <w:rPr>
-          <w:highlight w:val="yellow"/>
-        </w:rPr>
-        <w:t>appropriate</w:t>
-      </w:r>
-      <w:proofErr w:type="gramEnd"/>
-      <w:r>
-        <w:rPr>
-          <w:highlight w:val="yellow"/>
-        </w:rPr>
-        <w:t xml:space="preserve">, volume, number, month, publisher, city and state, editors, </w:t>
+        <w:t xml:space="preserve"> References must be complete, i.e., include, as appropriate, volume, number, month, publisher, city and state, editors, </w:t>
       </w:r>
       <w:r>
         <w:rPr>
@@ -2673,7 +2621,7 @@
 </file>
 
 <file path=word/endnotes.xml><?xml version="1.0" encoding="utf-8"?>
-<w:endnotes xmlns:wpc="http://schemas.microsoft.com/office/word/2010/wordprocessingCanvas" xmlns:cx="http://schemas.microsoft.com/office/drawing/2014/chartex" xmlns:cx1="http://schemas.microsoft.com/office/drawing/2015/9/8/chartex" xmlns:cx2="http://schemas.microsoft.com/office/drawing/2015/10/21/chartex" xmlns:cx3="http://schemas.microsoft.com/office/drawing/2016/5/9/chartex" xmlns:cx4="http://schemas.microsoft.com/office/drawing/2016/5/10/chartex" xmlns:cx5="http://schemas.microsoft.com/office/drawing/2016/5/11/chartex" xmlns:cx6="http://schemas.microsoft.com/office/drawing/2016/5/12/chartex" xmlns:cx7="http://schemas.microsoft.com/office/drawing/2016/5/13/chartex" xmlns:cx8="http://schemas.microsoft.com/office/drawing/2016/5/14/chartex" xmlns:mc="http://schemas.openxmlformats.org/markup-compatibility/2006" xmlns:aink="http://schemas.microsoft.com/office/drawing/2016/ink" xmlns:am3d="http://schemas.microsoft.com/office/drawing/2017/model3d" xmlns:o="urn:schemas-microsoft-com:office:office" xmlns:oel="http://schemas.microsoft.com/office/2019/extlst" xmlns:r="http://schemas.openxmlformats.org/officeDocument/2006/relationships" xmlns:m="http://schemas.openxmlformats.org/officeDocument/2006/math" xmlns:v="urn:schemas-microsoft-com:vml" xmlns:wp14="http://schemas.microsoft.com/office/word/2010/wordprocessingDrawing" xmlns:wp="http://schemas.openxmlformats.org/drawingml/2006/wordprocessingDrawing" xmlns:w10="urn:schemas-microsoft-com:office:word" xmlns:w="http://schemas.openxmlformats.org/wordprocessingml/2006/main" xmlns:w14="http://schemas.microsoft.com/office/word/2010/wordml" xmlns:w15="http://schemas.microsoft.com/office/word/2012/wordml" xmlns:w16cex="http://schemas.microsoft.com/office/word/2018/wordml/cex" xmlns:w16cid="http://schemas.microsoft.com/office/word/2016/wordml/cid" xmlns:w16="http://schemas.microsoft.com/office/word/2018/wordml" xmlns:w16du="http://schemas.microsoft.com/office/word/2023/wordml/word16du" xmlns:w16sdtdh="http://schemas.microsoft.com/office/word/2020/wordml/sdtdatahash" xmlns:w16sdtfl="http://schemas.microsoft.com/office/word/2024/wordml/sdtformatlock" xmlns:w16se="http://schemas.microsoft.com/office/word/2015/wordml/symex" xmlns:wpg="http://schemas.microsoft.com/office/word/2010/wordprocessingGroup" xmlns:wpi="http://schemas.microsoft.com/office/word/2010/wordprocessingInk" xmlns:wne="http://schemas.microsoft.com/office/word/2006/wordml" xmlns:wps="http://schemas.microsoft.com/office/word/2010/wordprocessingShape" mc:Ignorable="w14 w15 w16se w16cid w16 w16cex w16sdtdh w16sdtfl w16du wp14">
+<w:endnotes xmlns:wpc="http://schemas.microsoft.com/office/word/2010/wordprocessingCanvas" xmlns:cx="http://schemas.microsoft.com/office/drawing/2014/chartex" xmlns:cx1="http://schemas.microsoft.com/office/drawing/2015/9/8/chartex" xmlns:cx2="http://schemas.microsoft.com/office/drawing/2015/10/21/chartex" xmlns:cx3="http://schemas.microsoft.com/office/drawing/2016/5/9/chartex" xmlns:cx4="http://schemas.microsoft.com/office/drawing/2016/5/10/chartex" xmlns:cx5="http://schemas.microsoft.com/office/drawing/2016/5/11/chartex" xmlns:cx6="http://schemas.microsoft.com/office/drawing/2016/5/12/chartex" xmlns:cx7="http://schemas.microsoft.com/office/drawing/2016/5/13/chartex" xmlns:cx8="http://schemas.microsoft.com/office/drawing/2016/5/14/chartex" xmlns:mc="http://schemas.openxmlformats.org/markup-compatibility/2006" xmlns:m="http://schemas.openxmlformats.org/officeDocument/2006/math" xmlns:aink="http://schemas.microsoft.com/office/drawing/2016/ink" xmlns:am3d="http://schemas.microsoft.com/office/drawing/2017/model3d" xmlns:oel="http://schemas.microsoft.com/office/2019/extlst" xmlns:r="http://schemas.openxmlformats.org/officeDocument/2006/relationships" xmlns:wp14="http://schemas.microsoft.com/office/word/2010/wordprocessingDrawing" xmlns:wp="http://schemas.openxmlformats.org/drawingml/2006/wordprocessingDrawing" xmlns:wpg="http://schemas.microsoft.com/office/word/2010/wordprocessingGroup" xmlns:wpi="http://schemas.microsoft.com/office/word/2010/wordprocessingInk" xmlns:wps="http://schemas.microsoft.com/office/word/2010/wordprocessingShape" xmlns:o="urn:schemas-microsoft-com:office:office" xmlns:v="urn:schemas-microsoft-com:vml" xmlns:w10="urn:schemas-microsoft-com:office:word" xmlns:w="http://schemas.openxmlformats.org/wordprocessingml/2006/main" xmlns:w14="http://schemas.microsoft.com/office/word/2010/wordml" xmlns:w15="http://schemas.microsoft.com/office/word/2012/wordml" xmlns:w16cex="http://schemas.microsoft.com/office/word/2018/wordml/cex" xmlns:w16cid="http://schemas.microsoft.com/office/word/2016/wordml/cid" xmlns:w16="http://schemas.microsoft.com/office/word/2018/wordml" xmlns:w16sdtdh="http://schemas.microsoft.com/office/word/2020/wordml/sdtdatahash" xmlns:w16sdtfl="http://schemas.microsoft.com/office/word/2024/wordml/sdtformatlock" xmlns:w16se="http://schemas.microsoft.com/office/word/2015/wordml/symex" xmlns:w16du="http://schemas.microsoft.com/office/word/2023/wordml/word16du" xmlns:wne="http://schemas.microsoft.com/office/word/2006/wordml" mc:Ignorable="w14 w15 w16se w16cid w16 w16cex w16sdtdh w16sdtfl w16du wp14">
   <w:endnote w:type="separator" w:id="-1">
     <w:p>
       <w:r>
@@ -2692,7 +2640,7 @@
 </file>
 
 <file path=word/footer1.xml><?xml version="1.0" encoding="utf-8"?>
-<w:ftr xmlns:wpc="http://schemas.microsoft.com/office/word/2010/wordprocessingCanvas" xmlns:cx="http://schemas.microsoft.com/office/drawing/2014/chartex" xmlns:cx1="http://schemas.microsoft.com/office/drawing/2015/9/8/chartex" xmlns:cx2="http://schemas.microsoft.com/office/drawing/2015/10/21/chartex" xmlns:cx3="http://schemas.microsoft.com/office/drawing/2016/5/9/chartex" xmlns:cx4="http://schemas.microsoft.com/office/drawing/2016/5/10/chartex" xmlns:cx5="http://schemas.microsoft.com/office/drawing/2016/5/11/chartex" xmlns:cx6="http://schemas.microsoft.com/office/drawing/2016/5/12/chartex" xmlns:cx7="http://schemas.microsoft.com/office/drawing/2016/5/13/chartex" xmlns:cx8="http://schemas.microsoft.com/office/drawing/2016/5/14/chartex" xmlns:mc="http://schemas.openxmlformats.org/markup-compatibility/2006" xmlns:aink="http://schemas.microsoft.com/office/drawing/2016/ink" xmlns:am3d="http://schemas.microsoft.com/office/drawing/2017/model3d" xmlns:o="urn:schemas-microsoft-com:office:office" xmlns:oel="http://schemas.microsoft.com/office/2019/extlst" xmlns:r="http://schemas.openxmlformats.org/officeDocument/2006/relationships" xmlns:m="http://schemas.openxmlformats.org/officeDocument/2006/math" xmlns:v="urn:schemas-microsoft-com:vml" xmlns:wp14="http://schemas.microsoft.com/office/word/2010/wordprocessingDrawing" xmlns:wp="http://schemas.openxmlformats.org/drawingml/2006/wordprocessingDrawing" xmlns:w10="urn:schemas-microsoft-com:office:word" xmlns:w="http://schemas.openxmlformats.org/wordprocessingml/2006/main" xmlns:w14="http://schemas.microsoft.com/office/word/2010/wordml" xmlns:w15="http://schemas.microsoft.com/office/word/2012/wordml" xmlns:w16cex="http://schemas.microsoft.com/office/word/2018/wordml/cex" xmlns:w16cid="http://schemas.microsoft.com/office/word/2016/wordml/cid" xmlns:w16="http://schemas.microsoft.com/office/word/2018/wordml" xmlns:w16du="http://schemas.microsoft.com/office/word/2023/wordml/word16du" xmlns:w16sdtdh="http://schemas.microsoft.com/office/word/2020/wordml/sdtdatahash" xmlns:w16sdtfl="http://schemas.microsoft.com/office/word/2024/wordml/sdtformatlock" xmlns:w16se="http://schemas.microsoft.com/office/word/2015/wordml/symex" xmlns:wpg="http://schemas.microsoft.com/office/word/2010/wordprocessingGroup" xmlns:wpi="http://schemas.microsoft.com/office/word/2010/wordprocessingInk" xmlns:wne="http://schemas.microsoft.com/office/word/2006/wordml" xmlns:wps="http://schemas.microsoft.com/office/word/2010/wordprocessingShape" mc:Ignorable="w14 w15 w16se w16cid w16 w16cex w16sdtdh w16sdtfl w16du wp14">
+<w:ftr xmlns:wpc="http://schemas.microsoft.com/office/word/2010/wordprocessingCanvas" xmlns:cx="http://schemas.microsoft.com/office/drawing/2014/chartex" xmlns:cx1="http://schemas.microsoft.com/office/drawing/2015/9/8/chartex" xmlns:cx2="http://schemas.microsoft.com/office/drawing/2015/10/21/chartex" xmlns:cx3="http://schemas.microsoft.com/office/drawing/2016/5/9/chartex" xmlns:cx4="http://schemas.microsoft.com/office/drawing/2016/5/10/chartex" xmlns:cx5="http://schemas.microsoft.com/office/drawing/2016/5/11/chartex" xmlns:cx6="http://schemas.microsoft.com/office/drawing/2016/5/12/chartex" xmlns:cx7="http://schemas.microsoft.com/office/drawing/2016/5/13/chartex" xmlns:cx8="http://schemas.microsoft.com/office/drawing/2016/5/14/chartex" xmlns:mc="http://schemas.openxmlformats.org/markup-compatibility/2006" xmlns:m="http://schemas.openxmlformats.org/officeDocument/2006/math" xmlns:aink="http://schemas.microsoft.com/office/drawing/2016/ink" xmlns:am3d="http://schemas.microsoft.com/office/drawing/2017/model3d" xmlns:oel="http://schemas.microsoft.com/office/2019/extlst" xmlns:r="http://schemas.openxmlformats.org/officeDocument/2006/relationships" xmlns:wp14="http://schemas.microsoft.com/office/word/2010/wordprocessingDrawing" xmlns:wp="http://schemas.openxmlformats.org/drawingml/2006/wordprocessingDrawing" xmlns:wpg="http://schemas.microsoft.com/office/word/2010/wordprocessingGroup" xmlns:wpi="http://schemas.microsoft.com/office/word/2010/wordprocessingInk" xmlns:wps="http://schemas.microsoft.com/office/word/2010/wordprocessingShape" xmlns:o="urn:schemas-microsoft-com:office:office" xmlns:v="urn:schemas-microsoft-com:vml" xmlns:w10="urn:schemas-microsoft-com:office:word" xmlns:w="http://schemas.openxmlformats.org/wordprocessingml/2006/main" xmlns:w14="http://schemas.microsoft.com/office/word/2010/wordml" xmlns:w15="http://schemas.microsoft.com/office/word/2012/wordml" xmlns:w16cex="http://schemas.microsoft.com/office/word/2018/wordml/cex" xmlns:w16cid="http://schemas.microsoft.com/office/word/2016/wordml/cid" xmlns:w16="http://schemas.microsoft.com/office/word/2018/wordml" xmlns:w16sdtdh="http://schemas.microsoft.com/office/word/2020/wordml/sdtdatahash" xmlns:w16sdtfl="http://schemas.microsoft.com/office/word/2024/wordml/sdtformatlock" xmlns:w16se="http://schemas.microsoft.com/office/word/2015/wordml/symex" xmlns:w16du="http://schemas.microsoft.com/office/word/2023/wordml/word16du" xmlns:wne="http://schemas.microsoft.com/office/word/2006/wordml" mc:Ignorable="w14 w15 w16se w16cid w16 w16cex w16sdtdh w16sdtfl w16du wp14">
   <w:p>
     <w:pPr>
       <w:pStyle w:val="Footer"/>
@@ -2730,7 +2678,7 @@
 </file>
 
 <file path=word/footer2.xml><?xml version="1.0" encoding="utf-8"?>
-<w:ftr xmlns:wpc="http://schemas.microsoft.com/office/word/2010/wordprocessingCanvas" xmlns:cx="http://schemas.microsoft.com/office/drawing/2014/chartex" xmlns:cx1="http://schemas.microsoft.com/office/drawing/2015/9/8/chartex" xmlns:cx2="http://schemas.microsoft.com/office/drawing/2015/10/21/chartex" xmlns:cx3="http://schemas.microsoft.com/office/drawing/2016/5/9/chartex" xmlns:cx4="http://schemas.microsoft.com/office/drawing/2016/5/10/chartex" xmlns:cx5="http://schemas.microsoft.com/office/drawing/2016/5/11/chartex" xmlns:cx6="http://schemas.microsoft.com/office/drawing/2016/5/12/chartex" xmlns:cx7="http://schemas.microsoft.com/office/drawing/2016/5/13/chartex" xmlns:cx8="http://schemas.microsoft.com/office/drawing/2016/5/14/chartex" xmlns:mc="http://schemas.openxmlformats.org/markup-compatibility/2006" xmlns:aink="http://schemas.microsoft.com/office/drawing/2016/ink" xmlns:am3d="http://schemas.microsoft.com/office/drawing/2017/model3d" xmlns:o="urn:schemas-microsoft-com:office:office" xmlns:oel="http://schemas.microsoft.com/office/2019/extlst" xmlns:r="http://schemas.openxmlformats.org/officeDocument/2006/relationships" xmlns:m="http://schemas.openxmlformats.org/officeDocument/2006/math" xmlns:v="urn:schemas-microsoft-com:vml" xmlns:wp14="http://schemas.microsoft.com/office/word/2010/wordprocessingDrawing" xmlns:wp="http://schemas.openxmlformats.org/drawingml/2006/wordprocessingDrawing" xmlns:w10="urn:schemas-microsoft-com:office:word" xmlns:w="http://schemas.openxmlformats.org/wordprocessingml/2006/main" xmlns:w14="http://schemas.microsoft.com/office/word/2010/wordml" xmlns:w15="http://schemas.microsoft.com/office/word/2012/wordml" xmlns:w16cex="http://schemas.microsoft.com/office/word/2018/wordml/cex" xmlns:w16cid="http://schemas.microsoft.com/office/word/2016/wordml/cid" xmlns:w16="http://schemas.microsoft.com/office/word/2018/wordml" xmlns:w16du="http://schemas.microsoft.com/office/word/2023/wordml/word16du" xmlns:w16sdtdh="http://schemas.microsoft.com/office/word/2020/wordml/sdtdatahash" xmlns:w16sdtfl="http://schemas.microsoft.com/office/word/2024/wordml/sdtformatlock" xmlns:w16se="http://schemas.microsoft.com/office/word/2015/wordml/symex" xmlns:wpg="http://schemas.microsoft.com/office/word/2010/wordprocessingGroup" xmlns:wpi="http://schemas.microsoft.com/office/word/2010/wordprocessingInk" xmlns:wne="http://schemas.microsoft.com/office/word/2006/wordml" xmlns:wps="http://schemas.microsoft.com/office/word/2010/wordprocessingShape" mc:Ignorable="w14 w15 w16se w16cid w16 w16cex w16sdtdh w16sdtfl w16du wp14">
+<w:ftr xmlns:wpc="http://schemas.microsoft.com/office/word/2010/wordprocessingCanvas" xmlns:cx="http://schemas.microsoft.com/office/drawing/2014/chartex" xmlns:cx1="http://schemas.microsoft.com/office/drawing/2015/9/8/chartex" xmlns:cx2="http://schemas.microsoft.com/office/drawing/2015/10/21/chartex" xmlns:cx3="http://schemas.microsoft.com/office/drawing/2016/5/9/chartex" xmlns:cx4="http://schemas.microsoft.com/office/drawing/2016/5/10/chartex" xmlns:cx5="http://schemas.microsoft.com/office/drawing/2016/5/11/chartex" xmlns:cx6="http://schemas.microsoft.com/office/drawing/2016/5/12/chartex" xmlns:cx7="http://schemas.microsoft.com/office/drawing/2016/5/13/chartex" xmlns:cx8="http://schemas.microsoft.com/office/drawing/2016/5/14/chartex" xmlns:mc="http://schemas.openxmlformats.org/markup-compatibility/2006" xmlns:m="http://schemas.openxmlformats.org/officeDocument/2006/math" xmlns:aink="http://schemas.microsoft.com/office/drawing/2016/ink" xmlns:am3d="http://schemas.microsoft.com/office/drawing/2017/model3d" xmlns:oel="http://schemas.microsoft.com/office/2019/extlst" xmlns:r="http://schemas.openxmlformats.org/officeDocument/2006/relationships" xmlns:wp14="http://schemas.microsoft.com/office/word/2010/wordprocessingDrawing" xmlns:wp="http://schemas.openxmlformats.org/drawingml/2006/wordprocessingDrawing" xmlns:wpg="http://schemas.microsoft.com/office/word/2010/wordprocessingGroup" xmlns:wpi="http://schemas.microsoft.com/office/word/2010/wordprocessingInk" xmlns:wps="http://schemas.microsoft.com/office/word/2010/wordprocessingShape" xmlns:o="urn:schemas-microsoft-com:office:office" xmlns:v="urn:schemas-microsoft-com:vml" xmlns:w10="urn:schemas-microsoft-com:office:word" xmlns:w="http://schemas.openxmlformats.org/wordprocessingml/2006/main" xmlns:w14="http://schemas.microsoft.com/office/word/2010/wordml" xmlns:w15="http://schemas.microsoft.com/office/word/2012/wordml" xmlns:w16cex="http://schemas.microsoft.com/office/word/2018/wordml/cex" xmlns:w16cid="http://schemas.microsoft.com/office/word/2016/wordml/cid" xmlns:w16="http://schemas.microsoft.com/office/word/2018/wordml" xmlns:w16sdtdh="http://schemas.microsoft.com/office/word/2020/wordml/sdtdatahash" xmlns:w16sdtfl="http://schemas.microsoft.com/office/word/2024/wordml/sdtformatlock" xmlns:w16se="http://schemas.microsoft.com/office/word/2015/wordml/symex" xmlns:w16du="http://schemas.microsoft.com/office/word/2023/wordml/word16du" xmlns:wne="http://schemas.microsoft.com/office/word/2006/wordml" mc:Ignorable="w14 w15 w16se w16cid w16 w16cex w16sdtdh w16sdtfl w16du wp14">
   <w:p>
     <w:pPr>
       <w:pStyle w:val="Footer"/>
@@ -2911,7 +2859,7 @@
         <w:szCs w:val="18"/>
         <w:lang w:val="en-US"/>
       </w:rPr>
-      <w:t>3</w:t>
+      <w:t>2</w:t>
     </w:r>
     <w:r>
       <w:rPr>
@@ -2964,7 +2912,7 @@
 </file>
 
 <file path=word/footnotes.xml><?xml version="1.0" encoding="utf-8"?>
-<w:footnotes xmlns:wpc="http://schemas.microsoft.com/office/word/2010/wordprocessingCanvas" xmlns:cx="http://schemas.microsoft.com/office/drawing/2014/chartex" xmlns:cx1="http://schemas.microsoft.com/office/drawing/2015/9/8/chartex" xmlns:cx2="http://schemas.microsoft.com/office/drawing/2015/10/21/chartex" xmlns:cx3="http://schemas.microsoft.com/office/drawing/2016/5/9/chartex" xmlns:cx4="http://schemas.microsoft.com/office/drawing/2016/5/10/chartex" xmlns:cx5="http://schemas.microsoft.com/office/drawing/2016/5/11/chartex" xmlns:cx6="http://schemas.microsoft.com/office/drawing/2016/5/12/chartex" xmlns:cx7="http://schemas.microsoft.com/office/drawing/2016/5/13/chartex" xmlns:cx8="http://schemas.microsoft.com/office/drawing/2016/5/14/chartex" xmlns:mc="http://schemas.openxmlformats.org/markup-compatibility/2006" xmlns:aink="http://schemas.microsoft.com/office/drawing/2016/ink" xmlns:am3d="http://schemas.microsoft.com/office/drawing/2017/model3d" xmlns:o="urn:schemas-microsoft-com:office:office" xmlns:oel="http://schemas.microsoft.com/office/2019/extlst" xmlns:r="http://schemas.openxmlformats.org/officeDocument/2006/relationships" xmlns:m="http://schemas.openxmlformats.org/officeDocument/2006/math" xmlns:v="urn:schemas-microsoft-com:vml" xmlns:wp14="http://schemas.microsoft.com/office/word/2010/wordprocessingDrawing" xmlns:wp="http://schemas.openxmlformats.org/drawingml/2006/wordprocessingDrawing" xmlns:w10="urn:schemas-microsoft-com:office:word" xmlns:w="http://schemas.openxmlformats.org/wordprocessingml/2006/main" xmlns:w14="http://schemas.microsoft.com/office/word/2010/wordml" xmlns:w15="http://schemas.microsoft.com/office/word/2012/wordml" xmlns:w16cex="http://schemas.microsoft.com/office/word/2018/wordml/cex" xmlns:w16cid="http://schemas.microsoft.com/office/word/2016/wordml/cid" xmlns:w16="http://schemas.microsoft.com/office/word/2018/wordml" xmlns:w16du="http://schemas.microsoft.com/office/word/2023/wordml/word16du" xmlns:w16sdtdh="http://schemas.microsoft.com/office/word/2020/wordml/sdtdatahash" xmlns:w16sdtfl="http://schemas.microsoft.com/office/word/2024/wordml/sdtformatlock" xmlns:w16se="http://schemas.microsoft.com/office/word/2015/wordml/symex" xmlns:wpg="http://schemas.microsoft.com/office/word/2010/wordprocessingGroup" xmlns:wpi="http://schemas.microsoft.com/office/word/2010/wordprocessingInk" xmlns:wne="http://schemas.microsoft.com/office/word/2006/wordml" xmlns:wps="http://schemas.microsoft.com/office/word/2010/wordprocessingShape" mc:Ignorable="w14 w15 w16se w16cid w16 w16cex w16sdtdh w16sdtfl w16du wp14">
+<w:footnotes xmlns:wpc="http://schemas.microsoft.com/office/word/2010/wordprocessingCanvas" xmlns:cx="http://schemas.microsoft.com/office/drawing/2014/chartex" xmlns:cx1="http://schemas.microsoft.com/office/drawing/2015/9/8/chartex" xmlns:cx2="http://schemas.microsoft.com/office/drawing/2015/10/21/chartex" xmlns:cx3="http://schemas.microsoft.com/office/drawing/2016/5/9/chartex" xmlns:cx4="http://schemas.microsoft.com/office/drawing/2016/5/10/chartex" xmlns:cx5="http://schemas.microsoft.com/office/drawing/2016/5/11/chartex" xmlns:cx6="http://schemas.microsoft.com/office/drawing/2016/5/12/chartex" xmlns:cx7="http://schemas.microsoft.com/office/drawing/2016/5/13/chartex" xmlns:cx8="http://schemas.microsoft.com/office/drawing/2016/5/14/chartex" xmlns:mc="http://schemas.openxmlformats.org/markup-compatibility/2006" xmlns:m="http://schemas.openxmlformats.org/officeDocument/2006/math" xmlns:aink="http://schemas.microsoft.com/office/drawing/2016/ink" xmlns:am3d="http://schemas.microsoft.com/office/drawing/2017/model3d" xmlns:oel="http://schemas.microsoft.com/office/2019/extlst" xmlns:r="http://schemas.openxmlformats.org/officeDocument/2006/relationships" xmlns:wp14="http://schemas.microsoft.com/office/word/2010/wordprocessingDrawing" xmlns:wp="http://schemas.openxmlformats.org/drawingml/2006/wordprocessingDrawing" xmlns:wpg="http://schemas.microsoft.com/office/word/2010/wordprocessingGroup" xmlns:wpi="http://schemas.microsoft.com/office/word/2010/wordprocessingInk" xmlns:wps="http://schemas.microsoft.com/office/word/2010/wordprocessingShape" xmlns:o="urn:schemas-microsoft-com:office:office" xmlns:v="urn:schemas-microsoft-com:vml" xmlns:w10="urn:schemas-microsoft-com:office:word" xmlns:w="http://schemas.openxmlformats.org/wordprocessingml/2006/main" xmlns:w14="http://schemas.microsoft.com/office/word/2010/wordml" xmlns:w15="http://schemas.microsoft.com/office/word/2012/wordml" xmlns:w16cex="http://schemas.microsoft.com/office/word/2018/wordml/cex" xmlns:w16cid="http://schemas.microsoft.com/office/word/2016/wordml/cid" xmlns:w16="http://schemas.microsoft.com/office/word/2018/wordml" xmlns:w16sdtdh="http://schemas.microsoft.com/office/word/2020/wordml/sdtdatahash" xmlns:w16sdtfl="http://schemas.microsoft.com/office/word/2024/wordml/sdtformatlock" xmlns:w16se="http://schemas.microsoft.com/office/word/2015/wordml/symex" xmlns:w16du="http://schemas.microsoft.com/office/word/2023/wordml/word16du" xmlns:wne="http://schemas.microsoft.com/office/word/2006/wordml" mc:Ignorable="w14 w15 w16se w16cid w16 w16cex w16sdtdh w16sdtfl w16du wp14">
   <w:footnote w:type="separator" w:id="-1">
     <w:p>
       <w:r>
@@ -3010,7 +2958,7 @@
 </file>
 
 <file path=word/header1.xml><?xml version="1.0" encoding="utf-8"?>
-<w:hdr xmlns:wpc="http://schemas.microsoft.com/office/word/2010/wordprocessingCanvas" xmlns:cx="http://schemas.microsoft.com/office/drawing/2014/chartex" xmlns:cx1="http://schemas.microsoft.com/office/drawing/2015/9/8/chartex" xmlns:cx2="http://schemas.microsoft.com/office/drawing/2015/10/21/chartex" xmlns:cx3="http://schemas.microsoft.com/office/drawing/2016/5/9/chartex" xmlns:cx4="http://schemas.microsoft.com/office/drawing/2016/5/10/chartex" xmlns:cx5="http://schemas.microsoft.com/office/drawing/2016/5/11/chartex" xmlns:cx6="http://schemas.microsoft.com/office/drawing/2016/5/12/chartex" xmlns:cx7="http://schemas.microsoft.com/office/drawing/2016/5/13/chartex" xmlns:cx8="http://schemas.microsoft.com/office/drawing/2016/5/14/chartex" xmlns:mc="http://schemas.openxmlformats.org/markup-compatibility/2006" xmlns:aink="http://schemas.microsoft.com/office/drawing/2016/ink" xmlns:am3d="http://schemas.microsoft.com/office/drawing/2017/model3d" xmlns:o="urn:schemas-microsoft-com:office:office" xmlns:oel="http://schemas.microsoft.com/office/2019/extlst" xmlns:r="http://schemas.openxmlformats.org/officeDocument/2006/relationships" xmlns:m="http://schemas.openxmlformats.org/officeDocument/2006/math" xmlns:v="urn:schemas-microsoft-com:vml" xmlns:wp14="http://schemas.microsoft.com/office/word/2010/wordprocessingDrawing" xmlns:wp="http://schemas.openxmlformats.org/drawingml/2006/wordprocessingDrawing" xmlns:w10="urn:schemas-microsoft-com:office:word" xmlns:w="http://schemas.openxmlformats.org/wordprocessingml/2006/main" xmlns:w14="http://schemas.microsoft.com/office/word/2010/wordml" xmlns:w15="http://schemas.microsoft.com/office/word/2012/wordml" xmlns:w16cex="http://schemas.microsoft.com/office/word/2018/wordml/cex" xmlns:w16cid="http://schemas.microsoft.com/office/word/2016/wordml/cid" xmlns:w16="http://schemas.microsoft.com/office/word/2018/wordml" xmlns:w16du="http://schemas.microsoft.com/office/word/2023/wordml/word16du" xmlns:w16sdtdh="http://schemas.microsoft.com/office/word/2020/wordml/sdtdatahash" xmlns:w16sdtfl="http://schemas.microsoft.com/office/word/2024/wordml/sdtformatlock" xmlns:w16se="http://schemas.microsoft.com/office/word/2015/wordml/symex" xmlns:wpg="http://schemas.microsoft.com/office/word/2010/wordprocessingGroup" xmlns:wpi="http://schemas.microsoft.com/office/word/2010/wordprocessingInk" xmlns:wne="http://schemas.microsoft.com/office/word/2006/wordml" xmlns:wps="http://schemas.microsoft.com/office/word/2010/wordprocessingShape" mc:Ignorable="w14 w15 w16se w16cid w16 w16cex w16sdtdh w16sdtfl w16du wp14">
+<w:hdr xmlns:wpc="http://schemas.microsoft.com/office/word/2010/wordprocessingCanvas" xmlns:cx="http://schemas.microsoft.com/office/drawing/2014/chartex" xmlns:cx1="http://schemas.microsoft.com/office/drawing/2015/9/8/chartex" xmlns:cx2="http://schemas.microsoft.com/office/drawing/2015/10/21/chartex" xmlns:cx3="http://schemas.microsoft.com/office/drawing/2016/5/9/chartex" xmlns:cx4="http://schemas.microsoft.com/office/drawing/2016/5/10/chartex" xmlns:cx5="http://schemas.microsoft.com/office/drawing/2016/5/11/chartex" xmlns:cx6="http://schemas.microsoft.com/office/drawing/2016/5/12/chartex" xmlns:cx7="http://schemas.microsoft.com/office/drawing/2016/5/13/chartex" xmlns:cx8="http://schemas.microsoft.com/office/drawing/2016/5/14/chartex" xmlns:mc="http://schemas.openxmlformats.org/markup-compatibility/2006" xmlns:m="http://schemas.openxmlformats.org/officeDocument/2006/math" xmlns:aink="http://schemas.microsoft.com/office/drawing/2016/ink" xmlns:am3d="http://schemas.microsoft.com/office/drawing/2017/model3d" xmlns:oel="http://schemas.microsoft.com/office/2019/extlst" xmlns:r="http://schemas.openxmlformats.org/officeDocument/2006/relationships" xmlns:wp14="http://schemas.microsoft.com/office/word/2010/wordprocessingDrawing" xmlns:wp="http://schemas.openxmlformats.org/drawingml/2006/wordprocessingDrawing" xmlns:wpg="http://schemas.microsoft.com/office/word/2010/wordprocessingGroup" xmlns:wpi="http://schemas.microsoft.com/office/word/2010/wordprocessingInk" xmlns:wps="http://schemas.microsoft.com/office/word/2010/wordprocessingShape" xmlns:o="urn:schemas-microsoft-com:office:office" xmlns:v="urn:schemas-microsoft-com:vml" xmlns:w10="urn:schemas-microsoft-com:office:word" xmlns:w="http://schemas.openxmlformats.org/wordprocessingml/2006/main" xmlns:w14="http://schemas.microsoft.com/office/word/2010/wordml" xmlns:w15="http://schemas.microsoft.com/office/word/2012/wordml" xmlns:w16cex="http://schemas.microsoft.com/office/word/2018/wordml/cex" xmlns:w16cid="http://schemas.microsoft.com/office/word/2016/wordml/cid" xmlns:w16="http://schemas.microsoft.com/office/word/2018/wordml" xmlns:w16sdtdh="http://schemas.microsoft.com/office/word/2020/wordml/sdtdatahash" xmlns:w16sdtfl="http://schemas.microsoft.com/office/word/2024/wordml/sdtformatlock" xmlns:w16se="http://schemas.microsoft.com/office/word/2015/wordml/symex" xmlns:w16du="http://schemas.microsoft.com/office/word/2023/wordml/word16du" xmlns:wne="http://schemas.microsoft.com/office/word/2006/wordml" mc:Ignorable="w14 w15 w16se w16cid w16 w16cex w16sdtdh w16sdtfl w16du wp14">
   <w:tbl>
     <w:tblPr>
       <w:tblW w:w="10386" w:type="dxa"/>
@@ -3145,7 +3093,7 @@
 </file>
 
 <file path=word/numbering.xml><?xml version="1.0" encoding="utf-8"?>
-<w:numbering xmlns:wpc="http://schemas.microsoft.com/office/word/2010/wordprocessingCanvas" xmlns:cx="http://schemas.microsoft.com/office/drawing/2014/chartex" xmlns:cx1="http://schemas.microsoft.com/office/drawing/2015/9/8/chartex" xmlns:cx2="http://schemas.microsoft.com/office/drawing/2015/10/21/chartex" xmlns:cx3="http://schemas.microsoft.com/office/drawing/2016/5/9/chartex" xmlns:cx4="http://schemas.microsoft.com/office/drawing/2016/5/10/chartex" xmlns:cx5="http://schemas.microsoft.com/office/drawing/2016/5/11/chartex" xmlns:cx6="http://schemas.microsoft.com/office/drawing/2016/5/12/chartex" xmlns:cx7="http://schemas.microsoft.com/office/drawing/2016/5/13/chartex" xmlns:cx8="http://schemas.microsoft.com/office/drawing/2016/5/14/chartex" xmlns:mc="http://schemas.openxmlformats.org/markup-compatibility/2006" xmlns:aink="http://schemas.microsoft.com/office/drawing/2016/ink" xmlns:am3d="http://schemas.microsoft.com/office/drawing/2017/model3d" xmlns:o="urn:schemas-microsoft-com:office:office" xmlns:oel="http://schemas.microsoft.com/office/2019/extlst" xmlns:r="http://schemas.openxmlformats.org/officeDocument/2006/relationships" xmlns:m="http://schemas.openxmlformats.org/officeDocument/2006/math" xmlns:v="urn:schemas-microsoft-com:vml" xmlns:wp14="http://schemas.microsoft.com/office/word/2010/wordprocessingDrawing" xmlns:wp="http://schemas.openxmlformats.org/drawingml/2006/wordprocessingDrawing" xmlns:w10="urn:schemas-microsoft-com:office:word" xmlns:w="http://schemas.openxmlformats.org/wordprocessingml/2006/main" xmlns:w14="http://schemas.microsoft.com/office/word/2010/wordml" xmlns:w15="http://schemas.microsoft.com/office/word/2012/wordml" xmlns:w16cex="http://schemas.microsoft.com/office/word/2018/wordml/cex" xmlns:w16cid="http://schemas.microsoft.com/office/word/2016/wordml/cid" xmlns:w16="http://schemas.microsoft.com/office/word/2018/wordml" xmlns:w16du="http://schemas.microsoft.com/office/word/2023/wordml/word16du" xmlns:w16sdtdh="http://schemas.microsoft.com/office/word/2020/wordml/sdtdatahash" xmlns:w16sdtfl="http://schemas.microsoft.com/office/word/2024/wordml/sdtformatlock" xmlns:w16se="http://schemas.microsoft.com/office/word/2015/wordml/symex" xmlns:wpg="http://schemas.microsoft.com/office/word/2010/wordprocessingGroup" xmlns:wpi="http://schemas.microsoft.com/office/word/2010/wordprocessingInk" xmlns:wne="http://schemas.microsoft.com/office/word/2006/wordml" xmlns:wps="http://schemas.microsoft.com/office/word/2010/wordprocessingShape" mc:Ignorable="w14 w15 w16se w16cid w16 w16cex w16sdtdh w16sdtfl w16du wp14">
+<w:numbering xmlns:wpc="http://schemas.microsoft.com/office/word/2010/wordprocessingCanvas" xmlns:cx="http://schemas.microsoft.com/office/drawing/2014/chartex" xmlns:cx1="http://schemas.microsoft.com/office/drawing/2015/9/8/chartex" xmlns:cx2="http://schemas.microsoft.com/office/drawing/2015/10/21/chartex" xmlns:cx3="http://schemas.microsoft.com/office/drawing/2016/5/9/chartex" xmlns:cx4="http://schemas.microsoft.com/office/drawing/2016/5/10/chartex" xmlns:cx5="http://schemas.microsoft.com/office/drawing/2016/5/11/chartex" xmlns:cx6="http://schemas.microsoft.com/office/drawing/2016/5/12/chartex" xmlns:cx7="http://schemas.microsoft.com/office/drawing/2016/5/13/chartex" xmlns:cx8="http://schemas.microsoft.com/office/drawing/2016/5/14/chartex" xmlns:mc="http://schemas.openxmlformats.org/markup-compatibility/2006" xmlns:m="http://schemas.openxmlformats.org/officeDocument/2006/math" xmlns:aink="http://schemas.microsoft.com/office/drawing/2016/ink" xmlns:am3d="http://schemas.microsoft.com/office/drawing/2017/model3d" xmlns:oel="http://schemas.microsoft.com/office/2019/extlst" xmlns:r="http://schemas.openxmlformats.org/officeDocument/2006/relationships" xmlns:wp14="http://schemas.microsoft.com/office/word/2010/wordprocessingDrawing" xmlns:wp="http://schemas.openxmlformats.org/drawingml/2006/wordprocessingDrawing" xmlns:wpg="http://schemas.microsoft.com/office/word/2010/wordprocessingGroup" xmlns:wpi="http://schemas.microsoft.com/office/word/2010/wordprocessingInk" xmlns:wps="http://schemas.microsoft.com/office/word/2010/wordprocessingShape" xmlns:o="urn:schemas-microsoft-com:office:office" xmlns:v="urn:schemas-microsoft-com:vml" xmlns:w10="urn:schemas-microsoft-com:office:word" xmlns:w="http://schemas.openxmlformats.org/wordprocessingml/2006/main" xmlns:w14="http://schemas.microsoft.com/office/word/2010/wordml" xmlns:w15="http://schemas.microsoft.com/office/word/2012/wordml" xmlns:w16cex="http://schemas.microsoft.com/office/word/2018/wordml/cex" xmlns:w16cid="http://schemas.microsoft.com/office/word/2016/wordml/cid" xmlns:w16="http://schemas.microsoft.com/office/word/2018/wordml" xmlns:w16sdtdh="http://schemas.microsoft.com/office/word/2020/wordml/sdtdatahash" xmlns:w16sdtfl="http://schemas.microsoft.com/office/word/2024/wordml/sdtformatlock" xmlns:w16se="http://schemas.microsoft.com/office/word/2015/wordml/symex" xmlns:w16du="http://schemas.microsoft.com/office/word/2023/wordml/word16du" xmlns:wne="http://schemas.microsoft.com/office/word/2006/wordml" mc:Ignorable="w14 w15 w16se w16cid w16 w16cex w16sdtdh w16sdtfl w16du wp14">
   <w:abstractNum w:abstractNumId="0" w15:restartNumberingAfterBreak="0">
     <w:nsid w:val="FFFFFF7C"/>
     <w:multiLevelType w:val="singleLevel"/>
@@ -4640,7 +4588,7 @@
 </file>
 
 <file path=word/styles.xml><?xml version="1.0" encoding="utf-8"?>
-<w:styles xmlns:mc="http://schemas.openxmlformats.org/markup-compatibility/2006" xmlns:r="http://schemas.openxmlformats.org/officeDocument/2006/relationships" xmlns:w="http://schemas.openxmlformats.org/wordprocessingml/2006/main" xmlns:w14="http://schemas.microsoft.com/office/word/2010/wordml" xmlns:w15="http://schemas.microsoft.com/office/word/2012/wordml" xmlns:w16cex="http://schemas.microsoft.com/office/word/2018/wordml/cex" xmlns:w16cid="http://schemas.microsoft.com/office/word/2016/wordml/cid" xmlns:w16="http://schemas.microsoft.com/office/word/2018/wordml" xmlns:w16du="http://schemas.microsoft.com/office/word/2023/wordml/word16du" xmlns:w16sdtdh="http://schemas.microsoft.com/office/word/2020/wordml/sdtdatahash" xmlns:w16sdtfl="http://schemas.microsoft.com/office/word/2024/wordml/sdtformatlock" xmlns:w16se="http://schemas.microsoft.com/office/word/2015/wordml/symex" mc:Ignorable="w14 w15 w16se w16cid w16 w16cex w16sdtdh w16sdtfl w16du">
+<w:styles xmlns:mc="http://schemas.openxmlformats.org/markup-compatibility/2006" xmlns:r="http://schemas.openxmlformats.org/officeDocument/2006/relationships" xmlns:w="http://schemas.openxmlformats.org/wordprocessingml/2006/main" xmlns:w14="http://schemas.microsoft.com/office/word/2010/wordml" xmlns:w15="http://schemas.microsoft.com/office/word/2012/wordml" xmlns:w16cex="http://schemas.microsoft.com/office/word/2018/wordml/cex" xmlns:w16cid="http://schemas.microsoft.com/office/word/2016/wordml/cid" xmlns:w16="http://schemas.microsoft.com/office/word/2018/wordml" xmlns:w16sdtdh="http://schemas.microsoft.com/office/word/2020/wordml/sdtdatahash" xmlns:w16sdtfl="http://schemas.microsoft.com/office/word/2024/wordml/sdtformatlock" xmlns:w16se="http://schemas.microsoft.com/office/word/2015/wordml/symex" xmlns:w16du="http://schemas.microsoft.com/office/word/2023/wordml/word16du" mc:Ignorable="w14 w15 w16se w16cid w16 w16cex w16sdtdh w16sdtfl w16du">
   <w:docDefaults>
     <w:rPrDefault>
       <w:rPr>
@@ -5115,6 +5063,7 @@
   <w:style w:type="character" w:default="1" w:styleId="DefaultParagraphFont">
     <w:name w:val="Default Paragraph Font"/>
     <w:uiPriority w:val="1"/>
+    <w:semiHidden/>
     <w:unhideWhenUsed/>
   </w:style>
   <w:style w:type="table" w:default="1" w:styleId="TableNormal">

</xml_diff>